<commit_message>
Site: eval #7 on evals.finance, the Phase 2 arms noted, counts to seven evals; docs follow-up
- docs/index.html: seventh row (ETF NAV oversight), the agent-environment paragraph (32 / 35 / 27 / 25
  of 48), two findings panels (the AI checker; right decision, wrong arithmetic), facts 7 / 86 / ~450 / 22,
  the positioning sentence with the DAYJOB qualification, caveat 3-7 plus the five local models.
- README, LEADERBOARD: seven of eight paid models recomputed 51.9912 (the small model's recomputation
  was 51.4912), replacing "every model recomputed 51.9912".
- workflow note and the brief: the two designed-flaw scores under the hardened grader (stale_blind 0.354,
  date_slip 0.347); brief rebuilt (docx + PDF).
- Eval-7 article, driver post and video treatment (drafts), and the article cover
  (assets/cover-eval7.png, built by assets/make_cover_eval7.py from the case file and the saved runs).

Co-Authored-By: Claude Fable 5.1 <noreply@anthropic.com>
</commit_message>
<xml_diff>
--- a/content/eval7-nav-oversight-brief.docx
+++ b/content/eval7-nav-oversight-brief.docx
@@ -520,7 +520,7 @@
         <w:spacing w:after="120"/>
       </w:pPr>
       <w:r>
-        <w:t xml:space="preserve">Before any model ran, nine designed answers were scored to prove the grader localizes failures rather than averaging them away: every number right but the NAV released anyway scores 0.840 and raises the signature flag; adopting the stale mark and releasing scores 0.392; reviewing the prior day's package scores 0.371, the biggest cascade; holding the clean package scores 0.840 with the decision checkpoint at zero. The full table is in the workflow note.</w:t>
+        <w:t xml:space="preserve">Before any model ran, nine designed answers were scored to prove the grader localizes failures rather than averaging them away: every number right but the NAV released anyway scores 0.840 and raises the signature flag; adopting the stale mark and releasing scores 0.354; reviewing the prior day's package scores 0.347, the biggest cascade; holding the clean package scores 0.840 with the decision checkpoint at zero. The full table is in the workflow note.</w:t>
       </w:r>
     </w:p>
     <w:p>
@@ -1216,7 +1216,7 @@
         <w:t xml:space="preserve">Every model held the wrong NAV, </w:t>
       </w:r>
       <w:r>
-        <w:t xml:space="preserve">localized it to the swap line, recomputed 51.9912 and ran the reasonableness check the same way; every model released the clean package. Ten of sixteen runs met every criterion; three models did so on both cases.</w:t>
+        <w:t xml:space="preserve">localized it to the swap line, recomputed the NAV (seven of the eight at 51.9912) and ran the reasonableness check the same way; every model released the clean package. Ten of sixteen runs met every criterion; three models did so on both cases.</w:t>
       </w:r>
     </w:p>
     <w:p>

</xml_diff>